<commit_message>
Add real publications from OpenAlex + favicon; update report
- fetch_publications.py pulls real Bahria-affiliated works from OpenAlex and
  links co-authors to the roster. A field-overlap guard prevents same-name
  authors from other fields being wrongly attributed (fixed a namesake that
  had inflated one profile to 8745 citations).
- 197 verified real publications across 21 researchers, with real titles,
  venues, years, citations and DOIs; LaTeX markup stripped from titles.
- Add ResearchSense compass-star favicon (favicon.svg) to the browser tab.
- Update FYP report to state publications are real (OpenAlex); projects sample.
</commit_message>
<xml_diff>
--- a/ResearchSense_FYP_Report.docx
+++ b/ResearchSense_FYP_Report.docx
@@ -355,7 +355,7 @@
         <w:jc w:val="both"/>
       </w:pPr>
       <w:r>
-        <w:t>This first version of ResearchSense focuses on the full user interface and a working service that supplies data to it. The data for this version comes from the real faculty list of the Computer Science department at the E-8 campus, together with sample publications, topics, and projects that are clearly marked as sample. The system runs as a web application that any modern browser can open.</w:t>
+        <w:t>This first version of ResearchSense focuses on the full user interface and a working service that supplies data to it. The data for this version comes from the real faculty list of the Computer Science department at the E-8 campus, including real emails, research areas, and qualifications, together with real publications collected from the OpenAlex scholarly database. Project and funding records are sample values that are clearly marked as sample. The system runs as a web application that any modern browser can open.</w:t>
       </w:r>
     </w:p>
     <w:p>
@@ -856,7 +856,7 @@
         <w:jc w:val="both"/>
       </w:pPr>
       <w:r>
-        <w:t>The design works within a few constraints. The first version uses sample data for publications, topics, and projects, since the campus does not publish this data in a single feed. These records are marked as sample so their origin is always clear. The system does not include login or a live database in this phase, which keeps the current scope focused on the interface and the service.</w:t>
+        <w:t>The design works within a few constraints. Publications are real and come from the OpenAlex scholarly database, matched to Bahria affiliated authors. Project and funding records are sample data, since the campus does not publish these in a single feed, and they are marked as sample so their origin is always clear. The system does not include login or a live database in this phase, which keeps the current scope focused on the interface and the service.</w:t>
       </w:r>
     </w:p>
     <w:p>
@@ -1406,7 +1406,7 @@
         <w:jc w:val="both"/>
       </w:pPr>
       <w:r>
-        <w:t>One more external interface is used to prepare the data. A small script reads the public faculty list of the E-8 campus to build the starting records. This script runs on its own, away from the live system, so the running portal does not depend on any outside website.</w:t>
+        <w:t>Two more external interfaces are used to prepare the data. One script reads the public faculty list and profile pages of the E-8 campus to build the researcher records. A second script queries the OpenAlex scholarly database to collect real publications for the faculty. Both scripts run on their own, away from the live system, so the running portal does not depend on any outside website.</w:t>
       </w:r>
     </w:p>
     <w:p>

</xml_diff>

<commit_message>
Multi-campus: add H-11, Karachi, Lahore; campus filter; drop E-8 branding
- Scraper now reads the university faculty directory (bahria.edu.pk/Home/Faculty)
  and pulls real computing faculty across four campuses: 225 researchers with
  real name, campus, department, designation, email, research areas, education.
- Campus is first-class: schema/types field, campus filter across researchers,
  publications and projects, plus /api/researchers/campuses and stats.campuses.
- OpenAlex fetch stamps each publication with campus (675 real publications).
- Removed 'E-8' from all branding (wordmark, hero, titles, page copy) and the
  'Data: Bahria University E-8' footer line; E-8 is now just a campus value.
- Frontend: campus dropdowns on directory/publications/projects, campus shown
  on cards, profiles and publication rows.
- Updated FYP report for the four campuses. Removed unused roster_data.py.
</commit_message>
<xml_diff>
--- a/ResearchSense_FYP_Report.docx
+++ b/ResearchSense_FYP_Report.docx
@@ -69,7 +69,7 @@
           <w:b/>
           <w:sz w:val="40"/>
         </w:rPr>
-        <w:t>ResearchSense: A Research Information System for Bahria University Islamabad, E-8 Campus</w:t>
+        <w:t>ResearchSense: A Research Information System for Bahria University</w:t>
       </w:r>
     </w:p>
     <w:p>
@@ -174,7 +174,7 @@
         <w:jc w:val="both"/>
       </w:pPr>
       <w:r>
-        <w:t>ResearchSense is a web based research information system built for Bahria University Islamabad, E-8 campus. Universities produce a large amount of research every year, but the records of researchers, publications, and projects are often spread across separate files and web pages. This makes it hard for students, faculty, and outside visitors to find who works on a topic or what work the campus has produced.</w:t>
+        <w:t>ResearchSense is a web based research information system built for Bahria University, covering the computing faculty of its Islamabad (E-8 and H-11), Karachi and Lahore campuses. Universities produce a large amount of research every year, but the records of researchers, publications, and projects are often spread across separate files and web pages. This makes it hard for students, faculty, and outside visitors to find who works on a topic or what work the campus has produced.</w:t>
       </w:r>
     </w:p>
     <w:p>
@@ -235,7 +235,7 @@
         <w:jc w:val="both"/>
       </w:pPr>
       <w:r>
-        <w:t>At present the research record of Bahria University Islamabad, E-8 campus is hard to view as a whole. Faculty details sit on one set of pages, while publication lists, if they exist, sit somewhere else or on personal profiles on outside websites. A visitor who wants to know which teachers work on machine learning, or how many papers the campus has produced in a field, has no single place to look.</w:t>
+        <w:t>At present the research record of Bahria University is hard to view as a whole. Faculty details sit on one set of pages, spread across separate campuses, while publication lists, if they exist, sit somewhere else or on personal profiles on outside websites. A visitor who wants to know which teachers work on machine learning, or how many papers a campus has produced in a field, has no single place to look.</w:t>
       </w:r>
     </w:p>
     <w:p>
@@ -243,7 +243,7 @@
         <w:jc w:val="both"/>
       </w:pPr>
       <w:r>
-        <w:t>ResearchSense is a research information system that solves this problem. It collects the profiles of researchers, their publications, the topics they study, and the projects they lead, and it presents all of this through one clean web portal. The idea follows the style of well known university research portals, but it is shaped for the needs of Bahria University and uses the real faculty of the E-8 campus as its starting data.</w:t>
+        <w:t>ResearchSense is a research information system that solves this problem. It collects the profiles of researchers, their publications, the topics they study, and the projects they lead, and it presents all of this through one clean web portal. The idea follows the style of well known university research portals, but it is shaped for the needs of Bahria University and uses the real computing faculty of its four teaching campuses as its data.</w:t>
       </w:r>
     </w:p>
     <w:p>
@@ -355,7 +355,7 @@
         <w:jc w:val="both"/>
       </w:pPr>
       <w:r>
-        <w:t>This first version of ResearchSense focuses on the full user interface and a working service that supplies data to it. The data for this version comes from the real faculty list of the Computer Science department at the E-8 campus, including real emails, research areas, and qualifications, together with real publications collected from the OpenAlex scholarly database. Project and funding records are sample values that are clearly marked as sample. The system runs as a web application that any modern browser can open.</w:t>
+        <w:t>This first version of ResearchSense focuses on the full user interface and a working service that supplies data to it. The data for this version comes from the real computing faculty (Computer Science, Software Engineering and Computer Engineering) across the four campuses, including real emails, research areas, and qualifications, together with real publications collected from the OpenAlex scholarly database. Project and funding records are sample values that are clearly marked as sample. The system runs as a web application that any modern browser can open.</w:t>
       </w:r>
     </w:p>
     <w:p>
@@ -510,7 +510,7 @@
     </w:p>
     <w:p>
       <w:r>
-        <w:t>[6] Bahria University. Department of Computer Science, E-8 Campus. bahria.edu.pk.</w:t>
+        <w:t>[6] Bahria University. Faculty Directory. bahria.edu.pk/Home/Faculty.</w:t>
       </w:r>
     </w:p>
     <w:p>
@@ -1406,7 +1406,7 @@
         <w:jc w:val="both"/>
       </w:pPr>
       <w:r>
-        <w:t>Two more external interfaces are used to prepare the data. One script reads the public faculty list and profile pages of the E-8 campus to build the researcher records. A second script queries the OpenAlex scholarly database to collect real publications for the faculty. Both scripts run on their own, away from the live system, so the running portal does not depend on any outside website.</w:t>
+        <w:t>Two more external interfaces are used to prepare the data. One script reads the public faculty directory and profile pages of the university to build the researcher records for every campus. A second script queries the OpenAlex scholarly database to collect real publications for the faculty. Both scripts run on their own, away from the live system, so the running portal does not depend on any outside website.</w:t>
       </w:r>
     </w:p>
     <w:p>

</xml_diff>